<commit_message>
Audit Member Giving beta readiness
</commit_message>
<xml_diff>
--- a/Documentation/ChurchManager.Testing.Procedures.docx
+++ b/Documentation/ChurchManager.Testing.Procedures.docx
@@ -293,7 +293,7 @@
               <w:t xml:space="preserve">Scope boundary  </w:t>
             </w:r>
             <w:r>
-              <w:t>Financial, giving, donor, budget, ledger, envelope, check-posting, and donor-acknowledgment features are unfinished/unused prototypes. Confirm only that ordinary releases do not accidentally expose or activate them; do not treat them as operational workflows.</w:t>
+              <w:t>Accounting and Giving are active ChurchManager subsystems and must be tested only with fictitious data in the guarded test database. Giving screens, statements, imports, evidence files, backups, and reports are confidential even during testing. Never use production contributor data for development or acceptance testing.</w:t>
             </w:r>
           </w:p>
         </w:tc>
@@ -1714,7 +1714,7 @@
               <w:spacing w:after="0"/>
             </w:pPr>
             <w:r>
-              <w:t>Compare report catalog entries in the test database with LimeReportPattern files.</w:t>
+              <w:t>Compare enabled test-database catalog entries with JSForm visual report definitions.</w:t>
             </w:r>
           </w:p>
         </w:tc>
@@ -1734,7 +1734,7 @@
               <w:spacing w:after="0"/>
             </w:pPr>
             <w:r>
-              <w:t>Every enabled report maps to a real pattern; exceptions are documented.</w:t>
+              <w:t>Every enabled report maps to an approved JSON starter and dataset contract.</w:t>
             </w:r>
           </w:p>
         </w:tc>
@@ -1838,10 +1838,10 @@
                 <w:b/>
                 <w:color w:val="1F4D78"/>
               </w:rPr>
-              <w:t xml:space="preserve">Known report exception  </w:t>
+              <w:t xml:space="preserve">Retired report codes  </w:t>
             </w:r>
             <w:r>
-              <w:t>Historical catalog/template drift may include CMFD01 and CMCL01 without matching .lrxml files; CMMD01 may be related. Do not “fix” catalog data by assumption—verify against the test database and an expected report output first.</w:t>
+              <w:t>Migration 065 disables historical report codes that have no approved JSForm visual definition. Unknown codes fail closed rather than invoking an external report engine.</w:t>
             </w:r>
           </w:p>
         </w:tc>
@@ -3547,7 +3547,7 @@
               <w:spacing w:after="0"/>
             </w:pPr>
             <w:r>
-              <w:t>LimeReport</w:t>
+              <w:t>Visual reports</w:t>
             </w:r>
           </w:p>
         </w:tc>
@@ -3587,7 +3587,7 @@
               <w:spacing w:after="0"/>
             </w:pPr>
             <w:r>
-              <w:t>Use a missing test template or unavailable executable; verify diagnosis identifies the dependency.</w:t>
+              <w:t>Use a missing or invalid test definition; verify diagnosis identifies the definition or dataset problem.</w:t>
             </w:r>
           </w:p>
         </w:tc>
@@ -4191,7 +4191,7 @@
               <w:spacing w:after="0"/>
             </w:pPr>
             <w:r>
-              <w:t>LimeReport pattern/catalog</w:t>
+              <w:t>Visual report definition/catalog</w:t>
             </w:r>
           </w:p>
         </w:tc>
@@ -4211,7 +4211,7 @@
               <w:spacing w:after="0"/>
             </w:pPr>
             <w:r>
-              <w:t>Catalog mapping, parameters, PDF generation, grouping/totals, pagination, locked-output handling.</w:t>
+              <w:t>Catalog mapping, approved dataset, parameters, PDF generation, grouping/totals, pagination, locked-output handling.</w:t>
             </w:r>
           </w:p>
         </w:tc>
@@ -5827,7 +5827,7 @@
         <w:keepLines/>
       </w:pPr>
       <w:r>
-        <w:t>DevelopmentTesting/ — historical exploratory scripts; use only those that exercise ChurchManager-owned behavior, not JSForm internals.</w:t>
+        <w:t>tests/ — maintained ChurchManager application tests.</w:t>
       </w:r>
     </w:p>
     <w:p>
@@ -5836,7 +5836,7 @@
         <w:keepLines/>
       </w:pPr>
       <w:r>
-        <w:t>Forms/ and LimeReportPattern/ — ChurchManager screen definitions and visual report templates under test.</w:t>
+        <w:t>Forms/ and visual_reports/definitions/ — ChurchManager screen and report definitions under test.</w:t>
       </w:r>
     </w:p>
     <w:p>

</xml_diff>